<commit_message>
Enhance singularity demonstration with additional trials and controller updates
- Updated answers.md to reflect new observations from Trial 3, which crosses a shoulder singularity.
- Modified singularity_demo.py to implement Trial 3, including new joint configurations and condition thresholds for elbow and shoulder singularities.
- Introduced a new cartesian_path_controller.py for improved joint rate calculations during Cartesian motion.
- Added check_cartesian_path_controller.py to validate the functionality of the new controller.
- Enhanced singularity_scan.py to include metrics for shoulder singularities and updated configuration data.
</commit_message>
<xml_diff>
--- a/lab04_singularities/Lab04_Report_Template.docx
+++ b/lab04_singularities/Lab04_Report_Template.docx
@@ -22,7 +22,7 @@
     </w:p>
     <w:p>
       <w:r>
-        <w:t>Observe a stylus motion that begins at a bent-elbow pose and approaches a straight-elbow singularity. Compare the moderate joint rates in a well-conditioned baseline with the rapidly growing rates near singularity.</w:t>
+        <w:t>Observe three straight stylus motions: a well-conditioned baseline, an approach to a straight-elbow singularity, and an approach to a shoulder singularity. Compare where the robot moves rapidly even though Cartesian speed remains constant.</w:t>
       </w:r>
     </w:p>
     <w:p>
@@ -50,7 +50,7 @@
     </w:p>
     <w:p>
       <w:r>
-        <w:t>Before running Webots, predict where the Trial 2 joint-rate curve will rise and what will happen to the elbow at that point.</w:t>
+        <w:t>Before running Webots, predict which robot geometry and joint motion will identify the elbow and shoulder singularities in Trials 2 and 3.</w:t>
       </w:r>
     </w:p>
     <w:p>
@@ -81,7 +81,7 @@
     </w:p>
     <w:p>
       <w:r>
-        <w:t>Copy the three values printed by the singularity_demo controller.</w:t>
+        <w:t>Copy the three values printed by the singularity_demo controller for each trial.</w:t>
       </w:r>
     </w:p>
     <w:tbl>
@@ -95,11 +95,12 @@
         <w:gridCol w:w="2520"/>
         <w:gridCol w:w="2520"/>
         <w:gridCol w:w="2520"/>
+        <w:gridCol w:w="2016"/>
       </w:tblGrid>
       <w:tr>
         <w:tc>
           <w:tcPr>
-            <w:tcW w:type="dxa" w:w="3240"/>
+            <w:tcW w:type="dxa" w:w="3312"/>
             <w:vAlign w:val="center"/>
             <w:tcMar>
               <w:top w:w="100" w:type="dxa"/>
@@ -125,7 +126,7 @@
         </w:tc>
         <w:tc>
           <w:tcPr>
-            <w:tcW w:type="dxa" w:w="2232"/>
+            <w:tcW w:type="dxa" w:w="2016"/>
             <w:vAlign w:val="center"/>
             <w:tcMar>
               <w:top w:w="100" w:type="dxa"/>
@@ -153,7 +154,7 @@
         </w:tc>
         <w:tc>
           <w:tcPr>
-            <w:tcW w:type="dxa" w:w="2304"/>
+            <w:tcW w:type="dxa" w:w="2016"/>
             <w:vAlign w:val="center"/>
             <w:tcMar>
               <w:top w:w="100" w:type="dxa"/>
@@ -175,7 +176,36 @@
             <w:r>
               <w:t>Trial 2</w:t>
               <w:br/>
-              <w:t>Approach singularity</w:t>
+              <w:t>Approach elbow singularity</w:t>
+            </w:r>
+          </w:p>
+        </w:tc>
+        <w:tc>
+          <w:tcPr>
+            <w:tcW w:type="dxa" w:w="2016"/>
+            <w:vAlign w:val="center"/>
+            <w:tcMar>
+              <w:top w:w="100" w:type="dxa"/>
+              <w:start w:w="100" w:type="dxa"/>
+              <w:bottom w:w="100" w:type="dxa"/>
+              <w:end w:w="100" w:type="dxa"/>
+            </w:tcMar>
+            <w:tcBorders>
+              <w:top w:val="single" w:sz="6" w:color="D9D9D9"/>
+              <w:left w:val="single" w:sz="6" w:color="D9D9D9"/>
+              <w:bottom w:val="single" w:sz="6" w:color="D9D9D9"/>
+              <w:right w:val="single" w:sz="6" w:color="D9D9D9"/>
+              <w:insideH w:val="single" w:sz="6" w:color="D9D9D9"/>
+              <w:insideV w:val="single" w:sz="6" w:color="D9D9D9"/>
+            </w:tcBorders>
+            <w:shd w:fill="1F4E78"/>
+          </w:tcPr>
+          <w:p>
+            <w:pPr/>
+            <w:r>
+              <w:t>Trial 3</w:t>
+              <w:br/>
+              <w:t>Approach shoulder singularity</w:t>
             </w:r>
           </w:p>
         </w:tc>
@@ -183,7 +213,7 @@
       <w:tr>
         <w:tc>
           <w:tcPr>
-            <w:tcW w:type="dxa" w:w="3240"/>
+            <w:tcW w:type="dxa" w:w="3312"/>
             <w:vAlign w:val="center"/>
             <w:tcMar>
               <w:top w:w="100" w:type="dxa"/>
@@ -208,7 +238,7 @@
         </w:tc>
         <w:tc>
           <w:tcPr>
-            <w:tcW w:type="dxa" w:w="2232"/>
+            <w:tcW w:type="dxa" w:w="2016"/>
             <w:vAlign w:val="center"/>
             <w:tcMar>
               <w:top w:w="100" w:type="dxa"/>
@@ -231,7 +261,7 @@
         </w:tc>
         <w:tc>
           <w:tcPr>
-            <w:tcW w:type="dxa" w:w="2304"/>
+            <w:tcW w:type="dxa" w:w="2016"/>
             <w:vAlign w:val="center"/>
             <w:tcMar>
               <w:top w:w="100" w:type="dxa"/>
@@ -252,11 +282,35 @@
             <w:r/>
           </w:p>
         </w:tc>
+        <w:tc>
+          <w:tcPr>
+            <w:tcW w:type="dxa" w:w="2016"/>
+            <w:vAlign w:val="center"/>
+            <w:tcMar>
+              <w:top w:w="100" w:type="dxa"/>
+              <w:start w:w="100" w:type="dxa"/>
+              <w:bottom w:w="100" w:type="dxa"/>
+              <w:end w:w="100" w:type="dxa"/>
+            </w:tcMar>
+            <w:tcBorders>
+              <w:top w:val="single" w:sz="6" w:color="D9D9D9"/>
+              <w:left w:val="single" w:sz="6" w:color="D9D9D9"/>
+              <w:bottom w:val="single" w:sz="6" w:color="D9D9D9"/>
+              <w:right w:val="single" w:sz="6" w:color="D9D9D9"/>
+              <w:insideH w:val="single" w:sz="6" w:color="D9D9D9"/>
+              <w:insideV w:val="single" w:sz="6" w:color="D9D9D9"/>
+            </w:tcBorders>
+          </w:tcPr>
+          <w:p>
+            <w:pPr/>
+            <w:r/>
+          </w:p>
+        </w:tc>
       </w:tr>
       <w:tr>
         <w:tc>
           <w:tcPr>
-            <w:tcW w:type="dxa" w:w="3240"/>
+            <w:tcW w:type="dxa" w:w="3312"/>
             <w:vAlign w:val="center"/>
             <w:tcMar>
               <w:top w:w="100" w:type="dxa"/>
@@ -282,7 +336,7 @@
         </w:tc>
         <w:tc>
           <w:tcPr>
-            <w:tcW w:type="dxa" w:w="2232"/>
+            <w:tcW w:type="dxa" w:w="2016"/>
             <w:vAlign w:val="center"/>
             <w:tcMar>
               <w:top w:w="100" w:type="dxa"/>
@@ -306,7 +360,7 @@
         </w:tc>
         <w:tc>
           <w:tcPr>
-            <w:tcW w:type="dxa" w:w="2304"/>
+            <w:tcW w:type="dxa" w:w="2016"/>
             <w:vAlign w:val="center"/>
             <w:tcMar>
               <w:top w:w="100" w:type="dxa"/>
@@ -328,11 +382,36 @@
             <w:r/>
           </w:p>
         </w:tc>
+        <w:tc>
+          <w:tcPr>
+            <w:tcW w:type="dxa" w:w="2016"/>
+            <w:vAlign w:val="center"/>
+            <w:tcMar>
+              <w:top w:w="100" w:type="dxa"/>
+              <w:start w:w="100" w:type="dxa"/>
+              <w:bottom w:w="100" w:type="dxa"/>
+              <w:end w:w="100" w:type="dxa"/>
+            </w:tcMar>
+            <w:tcBorders>
+              <w:top w:val="single" w:sz="6" w:color="D9D9D9"/>
+              <w:left w:val="single" w:sz="6" w:color="D9D9D9"/>
+              <w:bottom w:val="single" w:sz="6" w:color="D9D9D9"/>
+              <w:right w:val="single" w:sz="6" w:color="D9D9D9"/>
+              <w:insideH w:val="single" w:sz="6" w:color="D9D9D9"/>
+              <w:insideV w:val="single" w:sz="6" w:color="D9D9D9"/>
+            </w:tcBorders>
+            <w:shd w:fill="EAF2F8"/>
+          </w:tcPr>
+          <w:p>
+            <w:pPr/>
+            <w:r/>
+          </w:p>
+        </w:tc>
       </w:tr>
       <w:tr>
         <w:tc>
           <w:tcPr>
-            <w:tcW w:type="dxa" w:w="3240"/>
+            <w:tcW w:type="dxa" w:w="3312"/>
             <w:vAlign w:val="center"/>
             <w:tcMar>
               <w:top w:w="100" w:type="dxa"/>
@@ -357,7 +436,7 @@
         </w:tc>
         <w:tc>
           <w:tcPr>
-            <w:tcW w:type="dxa" w:w="2232"/>
+            <w:tcW w:type="dxa" w:w="2016"/>
             <w:vAlign w:val="center"/>
             <w:tcMar>
               <w:top w:w="100" w:type="dxa"/>
@@ -380,7 +459,7 @@
         </w:tc>
         <w:tc>
           <w:tcPr>
-            <w:tcW w:type="dxa" w:w="2304"/>
+            <w:tcW w:type="dxa" w:w="2016"/>
             <w:vAlign w:val="center"/>
             <w:tcMar>
               <w:top w:w="100" w:type="dxa"/>
@@ -398,6 +477,30 @@
             </w:tcBorders>
           </w:tcPr>
           <w:p>
+            <w:r/>
+          </w:p>
+        </w:tc>
+        <w:tc>
+          <w:tcPr>
+            <w:tcW w:type="dxa" w:w="2016"/>
+            <w:vAlign w:val="center"/>
+            <w:tcMar>
+              <w:top w:w="100" w:type="dxa"/>
+              <w:start w:w="100" w:type="dxa"/>
+              <w:bottom w:w="100" w:type="dxa"/>
+              <w:end w:w="100" w:type="dxa"/>
+            </w:tcMar>
+            <w:tcBorders>
+              <w:top w:val="single" w:sz="6" w:color="D9D9D9"/>
+              <w:left w:val="single" w:sz="6" w:color="D9D9D9"/>
+              <w:bottom w:val="single" w:sz="6" w:color="D9D9D9"/>
+              <w:right w:val="single" w:sz="6" w:color="D9D9D9"/>
+              <w:insideH w:val="single" w:sz="6" w:color="D9D9D9"/>
+              <w:insideV w:val="single" w:sz="6" w:color="D9D9D9"/>
+            </w:tcBorders>
+          </w:tcPr>
+          <w:p>
+            <w:pPr/>
             <w:r/>
           </w:p>
         </w:tc>
@@ -442,7 +545,7 @@
     </w:p>
     <w:p>
       <w:r>
-        <w:t>Insert a Trial 1 baseline screenshot and a Trial 2 screenshot at the condition-number-200 checkpoint. The Trial 2 screenshot must show the on-scene joint-rate readout. Also insert the generated joint-rate comparison plot.</w:t>
+        <w:t>Insert one screenshot for each trial. Capture Trial 2 near its straight-elbow endpoint with the final singularity metrics and joint-rate readouts visible. Capture Trial 3 during its continuous shoulder-singularity crossing with the on-scene geometry and joint-rate readouts visible. The controller automatically generates the joint-rate comparison plot while the trials run. After Trial 3, read the complete saved location printed in the Webots console. In Word, choose Insert &gt; Pictures &gt; This Device and select lab04_singularities/joint_rate_comparison.svg, then place it in the final placeholder below.</w:t>
       </w:r>
     </w:p>
     <w:p>
@@ -494,7 +597,7 @@
         <w:pStyle w:val="Heading2"/>
       </w:pPr>
       <w:r>
-        <w:t>Trial 2 Approach Singularity Undamped</w:t>
+        <w:t>Trial 2 Approach Elbow Singularity Undamped</w:t>
       </w:r>
     </w:p>
     <w:tbl>
@@ -527,7 +630,7 @@
           </w:tcPr>
           <w:p>
             <w:r>
-              <w:t>Paste a screenshot of Trial 2 at the condition-number-200 checkpoint here.</w:t>
+              <w:t>Paste a screenshot of Trial 2 near the straight-elbow endpoint here. Keep the singularity metrics and joint-rate readouts visible.</w:t>
             </w:r>
           </w:p>
         </w:tc>
@@ -536,6 +639,103 @@
     <w:p>
       <w:r/>
     </w:p>
+    <w:p>
+      <w:pPr>
+        <w:pStyle w:val="Heading2"/>
+      </w:pPr>
+      <w:r>
+        <w:t>Trial 3 Approach Shoulder Singularity Undamped</w:t>
+      </w:r>
+    </w:p>
+    <w:tbl>
+      <w:tblPr>
+        <w:tblW w:type="auto" w:w="0"/>
+        <w:tblLook w:firstColumn="1" w:firstRow="1" w:lastColumn="0" w:lastRow="0" w:noHBand="0" w:noVBand="1" w:val="04A0"/>
+      </w:tblPr>
+      <w:tblGrid>
+        <w:gridCol w:w="10080"/>
+      </w:tblGrid>
+      <w:tr>
+        <w:tc>
+          <w:tcPr>
+            <w:tcW w:type="dxa" w:w="10080"/>
+            <w:vAlign w:val="center"/>
+            <w:tcBorders>
+              <w:top w:val="single" w:sz="8" w:color="A6A6A6"/>
+              <w:left w:val="single" w:sz="8" w:color="A6A6A6"/>
+              <w:bottom w:val="single" w:sz="8" w:color="A6A6A6"/>
+              <w:right w:val="single" w:sz="8" w:color="A6A6A6"/>
+              <w:insideH w:val="single" w:sz="8" w:color="A6A6A6"/>
+              <w:insideV w:val="single" w:sz="8" w:color="A6A6A6"/>
+            </w:tcBorders>
+            <w:tcMar>
+              <w:top w:w="150" w:type="dxa"/>
+              <w:start w:w="150" w:type="dxa"/>
+              <w:bottom w:w="150" w:type="dxa"/>
+              <w:end w:w="150" w:type="dxa"/>
+            </w:tcMar>
+          </w:tcPr>
+          <w:p>
+            <w:r>
+              <w:t>Paste a screenshot captured during the continuous Trial 3 crossing here.</w:t>
+            </w:r>
+          </w:p>
+        </w:tc>
+      </w:tr>
+    </w:tbl>
+    <w:p>
+      <w:pPr>
+        <w:pStyle w:val="Heading2"/>
+      </w:pPr>
+      <w:r>
+        <w:t>Joint Rate Comparison Plot</w:t>
+      </w:r>
+    </w:p>
+    <w:p>
+      <w:r>
+        <w:t>Paste the generated joint_rate_comparison.svg here. The plot should show all three trials and the 3.00 rad/s simulation limit.</w:t>
+      </w:r>
+    </w:p>
+    <w:tbl>
+      <w:tblPr>
+        <w:tblW w:type="auto" w:w="0"/>
+        <w:tblLayout w:type="fixed"/>
+        <w:tblLook w:firstColumn="1" w:firstRow="1" w:lastColumn="0" w:lastRow="0" w:noHBand="0" w:noVBand="1" w:val="04A0"/>
+      </w:tblPr>
+      <w:tblGrid>
+        <w:gridCol w:w="10080"/>
+      </w:tblGrid>
+      <w:tr>
+        <w:trPr>
+          <w:trHeight w:val="5040" w:hRule="atLeast"/>
+        </w:trPr>
+        <w:tc>
+          <w:tcPr>
+            <w:tcW w:type="dxa" w:w="10080"/>
+            <w:vAlign w:val="center"/>
+            <w:tcBorders>
+              <w:top w:val="single" w:sz="8" w:color="A6A6A6"/>
+              <w:left w:val="single" w:sz="8" w:color="A6A6A6"/>
+              <w:bottom w:val="single" w:sz="8" w:color="A6A6A6"/>
+              <w:right w:val="single" w:sz="8" w:color="A6A6A6"/>
+            </w:tcBorders>
+          </w:tcPr>
+          <w:p>
+            <w:pPr>
+              <w:jc w:val="center"/>
+            </w:pPr>
+            <w:r>
+              <w:rPr>
+                <w:sz w:val="22"/>
+              </w:rPr>
+              <w:t>Paste the generated joint-rate comparison plot here.</w:t>
+              <w:br/>
+              <w:t>File: lab04_singularities/joint_rate_comparison.svg</w:t>
+            </w:r>
+          </w:p>
+        </w:tc>
+      </w:tr>
+    </w:tbl>
     <w:p>
       <w:pPr>
         <w:pStyle w:val="Heading1"/>
@@ -624,7 +824,33 @@
         <w:pStyle w:val="Heading2"/>
       </w:pPr>
       <w:r>
-        <w:t>3  Why was it necessary to rate limit Trial 2 instead of sending the raw undamped command directly to Webots</w:t>
+        <w:t>3  What visual evidence shows that Trial 3 crosses a shoulder singularity rather than another elbow singularity</w:t>
+      </w:r>
+    </w:p>
+    <w:p>
+      <w:pPr/>
+      <w:r>
+        <w:t>________________________________________________________________________________</w:t>
+      </w:r>
+    </w:p>
+    <w:p>
+      <w:pPr/>
+      <w:r>
+        <w:t>________________________________________________________________________________</w:t>
+      </w:r>
+    </w:p>
+    <w:p>
+      <w:pPr/>
+      <w:r>
+        <w:t>________________________________________________________________________________</w:t>
+      </w:r>
+    </w:p>
+    <w:p>
+      <w:pPr>
+        <w:pStyle w:val="Heading2"/>
+      </w:pPr>
+      <w:r>
+        <w:t>4  Why was it necessary to rate limit the singularity trials instead of sending the raw undamped command directly to Webots</w:t>
       </w:r>
     </w:p>
     <w:p>
@@ -656,7 +882,7 @@
     </w:p>
     <w:p>
       <w:r>
-        <w:t>Before submitting  Confirm that the prediction, results table, two screenshots, joint-rate comparison plot, three answers, and your name are included. Save the personal copy as LastName_Lab04_Report.docx.</w:t>
+        <w:t>Before submitting  Confirm that the prediction, results table, three screenshots, joint-rate comparison plot, four answers, and your name are included. Save the personal copy as LastName_Lab04_Report.docx.</w:t>
       </w:r>
     </w:p>
     <w:sectPr>

</xml_diff>

<commit_message>
Update Lab 4 documentation: revise questions in report template and answers for clarity, focusing on singularity observations.
</commit_message>
<xml_diff>
--- a/lab04_singularities/Lab04_Report_Template.docx
+++ b/lab04_singularities/Lab04_Report_Template.docx
@@ -746,7 +746,7 @@
     </w:p>
     <w:p>
       <w:r>
-        <w:t>Answer each question in two or three sentences and refer to your recorded results.</w:t>
+        <w:t>Answer this question in two to four sentences. Use one observation from the Webots trials in your explanation.</w:t>
       </w:r>
     </w:p>
     <w:p>
@@ -754,7 +754,7 @@
         <w:pStyle w:val="Heading2"/>
       </w:pPr>
       <w:r>
-        <w:t>1  What happened to the minimum singular value and condition number as Trial 2 approached the straight elbow</w:t>
+        <w:t>Why can a small requested Cartesian motion require very large joint motion near a singularity?</w:t>
       </w:r>
     </w:p>
     <w:p>
@@ -786,93 +786,6 @@
     </w:p>
     <w:p>
       <w:pPr>
-        <w:pStyle w:val="Heading2"/>
-      </w:pPr>
-      <w:r>
-        <w:t>2  Why did the undamped joint rate rise near the end of Trial 2 even though Cartesian speed remained constant</w:t>
-      </w:r>
-    </w:p>
-    <w:p>
-      <w:pPr>
-        <w:keepLines/>
-        <w:spacing w:after="100"/>
-      </w:pPr>
-      <w:r>
-        <w:t>________________________________________________________________________________</w:t>
-      </w:r>
-    </w:p>
-    <w:p>
-      <w:pPr>
-        <w:keepLines/>
-        <w:spacing w:after="100"/>
-      </w:pPr>
-      <w:r>
-        <w:t>________________________________________________________________________________</w:t>
-      </w:r>
-    </w:p>
-    <w:p>
-      <w:pPr>
-        <w:keepLines/>
-        <w:spacing w:after="100"/>
-      </w:pPr>
-      <w:r>
-        <w:t>________________________________________________________________________________</w:t>
-      </w:r>
-    </w:p>
-    <w:p>
-      <w:pPr>
-        <w:pStyle w:val="Heading2"/>
-      </w:pPr>
-      <w:r>
-        <w:t>3  What visual evidence shows that Trial 3 crosses a shoulder singularity rather than another elbow singularity</w:t>
-      </w:r>
-    </w:p>
-    <w:p>
-      <w:pPr/>
-      <w:r>
-        <w:t>________________________________________________________________________________</w:t>
-      </w:r>
-    </w:p>
-    <w:p>
-      <w:pPr/>
-      <w:r>
-        <w:t>________________________________________________________________________________</w:t>
-      </w:r>
-    </w:p>
-    <w:p>
-      <w:pPr/>
-      <w:r>
-        <w:t>________________________________________________________________________________</w:t>
-      </w:r>
-    </w:p>
-    <w:p>
-      <w:pPr>
-        <w:pStyle w:val="Heading2"/>
-      </w:pPr>
-      <w:r>
-        <w:t>4  Why was it necessary to rate limit the singularity trials instead of sending the raw undamped command directly to Webots</w:t>
-      </w:r>
-    </w:p>
-    <w:p>
-      <w:pPr>
-        <w:keepLines/>
-        <w:spacing w:after="100"/>
-      </w:pPr>
-      <w:r>
-        <w:t>________________________________________________________________________________</w:t>
-      </w:r>
-    </w:p>
-    <w:p>
-      <w:pPr>
-        <w:keepLines/>
-        <w:spacing w:after="100"/>
-      </w:pPr>
-      <w:r>
-        <w:t>________________________________________________________________________________</w:t>
-      </w:r>
-    </w:p>
-    <w:p>
-      <w:pPr>
         <w:keepLines/>
         <w:spacing w:after="100"/>
       </w:pPr>
@@ -882,7 +795,7 @@
     </w:p>
     <w:p>
       <w:r>
-        <w:t>Before submitting  Confirm that the prediction, results table, three screenshots, joint-rate comparison plot, four answers, and your name are included. Save the personal copy as LastName_Lab04_Report.docx.</w:t>
+        <w:t>Before submitting  Confirm that the prediction, results table, three screenshots, joint-rate comparison plot, one singularity answer, and your name are included. Save the personal copy as LastName_Lab04_Report.docx.</w:t>
       </w:r>
     </w:p>
     <w:sectPr>

</xml_diff>